<commit_message>
[r] Change main report + add 3 separated reports
</commit_message>
<xml_diff>
--- a/ТРКПО_ПотаповаСкарлыгинаФесенкоЧулков_5130904_20104.docx
+++ b/ТРКПО_ПотаповаСкарлыгинаФесенкоЧулков_5130904_20104.docx
@@ -4215,6 +4215,7 @@
       </w:pPr>
       <w:r>
         <w:rPr>
+          <w:noProof/>
           <w:color w:val="000000" w:themeColor="text1"/>
           <w:sz w:val="28"/>
           <w:szCs w:val="28"/>
@@ -4275,6 +4276,7 @@
       </w:pPr>
       <w:r>
         <w:rPr>
+          <w:noProof/>
           <w:color w:val="000000" w:themeColor="text1"/>
           <w:sz w:val="28"/>
           <w:szCs w:val="28"/>
@@ -5093,8 +5095,6 @@
       <w:pPr>
         <w:pStyle w:val="2"/>
       </w:pPr>
-      <w:bookmarkStart w:id="9" w:name="_GoBack"/>
-      <w:bookmarkEnd w:id="9"/>
       <w:r>
         <w:t>Процедура расширения тестового набора</w:t>
       </w:r>
@@ -5262,7 +5262,7 @@
       <w:pPr>
         <w:pStyle w:val="1"/>
       </w:pPr>
-      <w:bookmarkStart w:id="10" w:name="_Toc226015220"/>
+      <w:bookmarkStart w:id="9" w:name="_Toc226015220"/>
       <w:r>
         <w:lastRenderedPageBreak/>
         <w:t>Системное</w:t>
@@ -5300,7 +5300,7 @@
       <w:r>
         <w:t>тестирование</w:t>
       </w:r>
-      <w:bookmarkEnd w:id="10"/>
+      <w:bookmarkEnd w:id="9"/>
     </w:p>
     <w:p>
       <w:pPr>
@@ -5340,11 +5340,11 @@
       <w:pPr>
         <w:pStyle w:val="2"/>
       </w:pPr>
-      <w:bookmarkStart w:id="11" w:name="_Toc226015221"/>
+      <w:bookmarkStart w:id="10" w:name="_Toc226015221"/>
       <w:r>
         <w:t>Описание выполненной работы и инструментов</w:t>
       </w:r>
-      <w:bookmarkEnd w:id="11"/>
+      <w:bookmarkEnd w:id="10"/>
     </w:p>
     <w:p>
       <w:pPr>
@@ -5436,7 +5436,7 @@
       <w:pPr>
         <w:pStyle w:val="2"/>
       </w:pPr>
-      <w:bookmarkStart w:id="12" w:name="_Toc226015222"/>
+      <w:bookmarkStart w:id="11" w:name="_Toc226015222"/>
       <w:r>
         <w:t>Тест</w:t>
       </w:r>
@@ -5444,7 +5444,7 @@
         <w:noBreakHyphen/>
         <w:t>план (описание сценариев)</w:t>
       </w:r>
-      <w:bookmarkEnd w:id="12"/>
+      <w:bookmarkEnd w:id="11"/>
     </w:p>
     <w:p>
       <w:r>
@@ -5464,11 +5464,7 @@
       </w:r>
       <w:proofErr w:type="spellEnd"/>
       <w:r>
-        <w:t xml:space="preserve"> тесты охватывают 10 основных сценариев, предварительно описанных в тест</w:t>
-      </w:r>
-      <w:r>
-        <w:noBreakHyphen/>
-        <w:t>плане и согласованных с преподавателем:</w:t>
+        <w:t xml:space="preserve"> тесты охватывают 10 основных сценариев:</w:t>
       </w:r>
     </w:p>
     <w:p>
@@ -5505,6 +5501,353 @@
     </w:p>
     <w:p>
       <w:pPr>
+        <w:ind w:left="720"/>
+      </w:pPr>
+      <w:r>
+        <w:rPr>
+          <w:b/>
+          <w:bCs/>
+        </w:rPr>
+        <w:t>Предусловия:</w:t>
+      </w:r>
+      <w:r>
+        <w:t xml:space="preserve"> База данных пуста или готова; </w:t>
+      </w:r>
+      <w:proofErr w:type="spellStart"/>
+      <w:r>
+        <w:t>system</w:t>
+      </w:r>
+      <w:r>
+        <w:t>_</w:t>
+      </w:r>
+      <w:r>
+        <w:t>auth</w:t>
+      </w:r>
+      <w:proofErr w:type="spellEnd"/>
+      <w:r>
+        <w:t xml:space="preserve">, </w:t>
+      </w:r>
+      <w:proofErr w:type="spellStart"/>
+      <w:r>
+        <w:t>system</w:t>
+      </w:r>
+      <w:r>
+        <w:t>_</w:t>
+      </w:r>
+      <w:r>
+        <w:t>timer</w:t>
+      </w:r>
+      <w:proofErr w:type="spellEnd"/>
+      <w:r>
+        <w:t xml:space="preserve">, </w:t>
+      </w:r>
+      <w:proofErr w:type="spellStart"/>
+      <w:r>
+        <w:t>system</w:t>
+      </w:r>
+      <w:r>
+        <w:t>_</w:t>
+      </w:r>
+      <w:r>
+        <w:t>db</w:t>
+      </w:r>
+      <w:proofErr w:type="spellEnd"/>
+      <w:r>
+        <w:t xml:space="preserve"> доступны; пользователь '</w:t>
+      </w:r>
+      <w:proofErr w:type="spellStart"/>
+      <w:r>
+        <w:t>load</w:t>
+      </w:r>
+      <w:r>
+        <w:t>_</w:t>
+      </w:r>
+      <w:r>
+        <w:t>user</w:t>
+      </w:r>
+      <w:proofErr w:type="spellEnd"/>
+      <w:r>
+        <w:t>' не существует.</w:t>
+      </w:r>
+    </w:p>
+    <w:p>
+      <w:pPr>
+        <w:ind w:left="720"/>
+      </w:pPr>
+      <w:r>
+        <w:rPr>
+          <w:b/>
+          <w:bCs/>
+        </w:rPr>
+        <w:t>Шаги:</w:t>
+      </w:r>
+    </w:p>
+    <w:p>
+      <w:pPr>
+        <w:numPr>
+          <w:ilvl w:val="0"/>
+          <w:numId w:val="25"/>
+        </w:numPr>
+      </w:pPr>
+      <w:r>
+        <w:t>Зарегистрировать пользователя '</w:t>
+      </w:r>
+      <w:proofErr w:type="spellStart"/>
+      <w:r>
+        <w:t>load</w:t>
+      </w:r>
+      <w:proofErr w:type="spellEnd"/>
+      <w:r>
+        <w:rPr>
+          <w:lang w:val="en-US"/>
+        </w:rPr>
+        <w:t>_</w:t>
+      </w:r>
+      <w:proofErr w:type="spellStart"/>
+      <w:r>
+        <w:t>user</w:t>
+      </w:r>
+      <w:proofErr w:type="spellEnd"/>
+      <w:r>
+        <w:t>'.</w:t>
+      </w:r>
+    </w:p>
+    <w:p>
+      <w:pPr>
+        <w:numPr>
+          <w:ilvl w:val="0"/>
+          <w:numId w:val="25"/>
+        </w:numPr>
+      </w:pPr>
+      <w:proofErr w:type="spellStart"/>
+      <w:r>
+        <w:lastRenderedPageBreak/>
+        <w:t>Залогиниться</w:t>
+      </w:r>
+      <w:proofErr w:type="spellEnd"/>
+      <w:r>
+        <w:t xml:space="preserve"> под '</w:t>
+      </w:r>
+      <w:proofErr w:type="spellStart"/>
+      <w:r>
+        <w:t>load</w:t>
+      </w:r>
+      <w:proofErr w:type="spellEnd"/>
+      <w:r>
+        <w:rPr>
+          <w:lang w:val="en-US"/>
+        </w:rPr>
+        <w:t>_</w:t>
+      </w:r>
+      <w:proofErr w:type="spellStart"/>
+      <w:r>
+        <w:t>user</w:t>
+      </w:r>
+      <w:proofErr w:type="spellEnd"/>
+      <w:r>
+        <w:t>'.</w:t>
+      </w:r>
+    </w:p>
+    <w:p>
+      <w:pPr>
+        <w:numPr>
+          <w:ilvl w:val="0"/>
+          <w:numId w:val="25"/>
+        </w:numPr>
+        <w:rPr>
+          <w:lang w:val="en-US"/>
+        </w:rPr>
+      </w:pPr>
+      <w:r>
+        <w:t>Измерить</w:t>
+      </w:r>
+      <w:r>
+        <w:rPr>
+          <w:lang w:val="en-US"/>
+        </w:rPr>
+        <w:t xml:space="preserve"> </w:t>
+      </w:r>
+      <w:r>
+        <w:t>время</w:t>
+      </w:r>
+      <w:r>
+        <w:rPr>
+          <w:lang w:val="en-US"/>
+        </w:rPr>
+        <w:t xml:space="preserve">; </w:t>
+      </w:r>
+      <w:r>
+        <w:t>в</w:t>
+      </w:r>
+      <w:r>
+        <w:rPr>
+          <w:lang w:val="en-US"/>
+        </w:rPr>
+        <w:t xml:space="preserve"> </w:t>
+      </w:r>
+      <w:r>
+        <w:t>цикле</w:t>
+      </w:r>
+      <w:r>
+        <w:rPr>
+          <w:lang w:val="en-US"/>
+        </w:rPr>
+        <w:t xml:space="preserve"> 180 </w:t>
+      </w:r>
+      <w:r>
+        <w:t>раз</w:t>
+      </w:r>
+      <w:r>
+        <w:rPr>
+          <w:lang w:val="en-US"/>
+        </w:rPr>
+        <w:t xml:space="preserve">: </w:t>
+      </w:r>
+      <w:proofErr w:type="spellStart"/>
+      <w:r>
+        <w:rPr>
+          <w:lang w:val="en-US"/>
+        </w:rPr>
+        <w:t>start</w:t>
+      </w:r>
+      <w:r>
+        <w:rPr>
+          <w:lang w:val="en-US"/>
+        </w:rPr>
+        <w:t>_</w:t>
+      </w:r>
+      <w:proofErr w:type="gramStart"/>
+      <w:r>
+        <w:rPr>
+          <w:lang w:val="en-US"/>
+        </w:rPr>
+        <w:t>session</w:t>
+      </w:r>
+      <w:proofErr w:type="spellEnd"/>
+      <w:r>
+        <w:rPr>
+          <w:lang w:val="en-US"/>
+        </w:rPr>
+        <w:t>(</w:t>
+      </w:r>
+      <w:proofErr w:type="spellStart"/>
+      <w:proofErr w:type="gramEnd"/>
+      <w:r>
+        <w:rPr>
+          <w:lang w:val="en-US"/>
+        </w:rPr>
+        <w:t>user</w:t>
+      </w:r>
+      <w:r>
+        <w:rPr>
+          <w:lang w:val="en-US"/>
+        </w:rPr>
+        <w:t>_</w:t>
+      </w:r>
+      <w:r>
+        <w:rPr>
+          <w:lang w:val="en-US"/>
+        </w:rPr>
+        <w:t>id</w:t>
+      </w:r>
+      <w:proofErr w:type="spellEnd"/>
+      <w:r>
+        <w:rPr>
+          <w:lang w:val="en-US"/>
+        </w:rPr>
+        <w:t>, '</w:t>
+      </w:r>
+      <w:r>
+        <w:rPr>
+          <w:lang w:val="en-US"/>
+        </w:rPr>
+        <w:t>stopwatch</w:t>
+      </w:r>
+      <w:r>
+        <w:rPr>
+          <w:lang w:val="en-US"/>
+        </w:rPr>
+        <w:t xml:space="preserve">', </w:t>
+      </w:r>
+      <w:r>
+        <w:rPr>
+          <w:lang w:val="en-US"/>
+        </w:rPr>
+        <w:t>callback</w:t>
+      </w:r>
+      <w:r>
+        <w:rPr>
+          <w:lang w:val="en-US"/>
+        </w:rPr>
+        <w:t>=</w:t>
+      </w:r>
+      <w:r>
+        <w:rPr>
+          <w:lang w:val="en-US"/>
+        </w:rPr>
+        <w:t>None</w:t>
+      </w:r>
+      <w:r>
+        <w:rPr>
+          <w:lang w:val="en-US"/>
+        </w:rPr>
+        <w:t xml:space="preserve">), </w:t>
+      </w:r>
+      <w:proofErr w:type="spellStart"/>
+      <w:r>
+        <w:rPr>
+          <w:lang w:val="en-US"/>
+        </w:rPr>
+        <w:t>stop</w:t>
+      </w:r>
+      <w:r>
+        <w:rPr>
+          <w:lang w:val="en-US"/>
+        </w:rPr>
+        <w:t>_</w:t>
+      </w:r>
+      <w:r>
+        <w:rPr>
+          <w:lang w:val="en-US"/>
+        </w:rPr>
+        <w:t>timer</w:t>
+      </w:r>
+      <w:proofErr w:type="spellEnd"/>
+      <w:r>
+        <w:rPr>
+          <w:lang w:val="en-US"/>
+        </w:rPr>
+        <w:t>().</w:t>
+      </w:r>
+    </w:p>
+    <w:p>
+      <w:pPr>
+        <w:numPr>
+          <w:ilvl w:val="0"/>
+          <w:numId w:val="25"/>
+        </w:numPr>
+      </w:pPr>
+      <w:r>
+        <w:rPr>
+          <w:b/>
+          <w:bCs/>
+        </w:rPr>
+        <w:t>Проверки:</w:t>
+      </w:r>
+      <w:r>
+        <w:t xml:space="preserve"> </w:t>
+      </w:r>
+      <w:r>
+        <w:t>Количество сессий в БД = 180; время выполнения ≤ 12 сек.</w:t>
+      </w:r>
+    </w:p>
+    <w:p>
+      <w:pPr>
+        <w:ind w:left="720"/>
+      </w:pPr>
+    </w:p>
+    <w:p>
+      <w:pPr>
         <w:numPr>
           <w:ilvl w:val="0"/>
           <w:numId w:val="10"/>
@@ -5532,14 +5875,612 @@
     </w:p>
     <w:p>
       <w:pPr>
+        <w:ind w:left="720"/>
+      </w:pPr>
+      <w:r>
+        <w:rPr>
+          <w:b/>
+          <w:bCs/>
+        </w:rPr>
+        <w:t xml:space="preserve">Предусловия: </w:t>
+      </w:r>
+      <w:proofErr w:type="spellStart"/>
+      <w:r>
+        <w:t>system_auth</w:t>
+      </w:r>
+      <w:proofErr w:type="spellEnd"/>
+      <w:r>
+        <w:t xml:space="preserve">, </w:t>
+      </w:r>
+      <w:proofErr w:type="spellStart"/>
+      <w:r>
+        <w:t>system_timer</w:t>
+      </w:r>
+      <w:proofErr w:type="spellEnd"/>
+      <w:r>
+        <w:t xml:space="preserve">, </w:t>
+      </w:r>
+      <w:proofErr w:type="spellStart"/>
+      <w:r>
+        <w:t>system_db</w:t>
+      </w:r>
+      <w:proofErr w:type="spellEnd"/>
+      <w:r>
+        <w:t xml:space="preserve"> доступны; пользователь '</w:t>
+      </w:r>
+      <w:proofErr w:type="spellStart"/>
+      <w:r>
+        <w:t>stable_user</w:t>
+      </w:r>
+      <w:proofErr w:type="spellEnd"/>
+      <w:r>
+        <w:t>' не существует; планировщик очищен.</w:t>
+      </w:r>
+    </w:p>
+    <w:p>
+      <w:pPr>
+        <w:ind w:left="720"/>
+      </w:pPr>
+      <w:r>
+        <w:rPr>
+          <w:b/>
+          <w:bCs/>
+        </w:rPr>
+        <w:t>Шаги:</w:t>
+      </w:r>
+    </w:p>
+    <w:p>
+      <w:pPr>
+        <w:numPr>
+          <w:ilvl w:val="0"/>
+          <w:numId w:val="26"/>
+        </w:numPr>
+      </w:pPr>
+      <w:r>
+        <w:t xml:space="preserve">Зарегистрировать и </w:t>
+      </w:r>
+      <w:proofErr w:type="spellStart"/>
+      <w:r>
+        <w:t>залогинить</w:t>
+      </w:r>
+      <w:proofErr w:type="spellEnd"/>
+      <w:r>
+        <w:t xml:space="preserve"> '</w:t>
+      </w:r>
+      <w:proofErr w:type="spellStart"/>
+      <w:r>
+        <w:t>stable_user</w:t>
+      </w:r>
+      <w:proofErr w:type="spellEnd"/>
+      <w:r>
+        <w:t>'.</w:t>
+      </w:r>
+    </w:p>
+    <w:p>
+      <w:pPr>
+        <w:numPr>
+          <w:ilvl w:val="0"/>
+          <w:numId w:val="26"/>
+        </w:numPr>
+        <w:rPr>
+          <w:lang w:val="en-US"/>
+        </w:rPr>
+      </w:pPr>
+      <w:r>
+        <w:t>Измерить</w:t>
+      </w:r>
+      <w:r>
+        <w:rPr>
+          <w:lang w:val="en-US"/>
+        </w:rPr>
+        <w:t xml:space="preserve"> </w:t>
+      </w:r>
+      <w:r>
+        <w:t>время</w:t>
+      </w:r>
+      <w:r>
+        <w:rPr>
+          <w:lang w:val="en-US"/>
+        </w:rPr>
+        <w:t xml:space="preserve">; </w:t>
+      </w:r>
+      <w:r>
+        <w:t>в</w:t>
+      </w:r>
+      <w:r>
+        <w:rPr>
+          <w:lang w:val="en-US"/>
+        </w:rPr>
+        <w:t xml:space="preserve"> </w:t>
+      </w:r>
+      <w:r>
+        <w:t>цикле</w:t>
+      </w:r>
+      <w:r>
+        <w:rPr>
+          <w:lang w:val="en-US"/>
+        </w:rPr>
+        <w:t xml:space="preserve"> 140 </w:t>
+      </w:r>
+      <w:r>
+        <w:t>раз</w:t>
+      </w:r>
+      <w:r>
+        <w:rPr>
+          <w:lang w:val="en-US"/>
+        </w:rPr>
+        <w:t xml:space="preserve">: </w:t>
+      </w:r>
+      <w:proofErr w:type="spellStart"/>
+      <w:r>
+        <w:rPr>
+          <w:lang w:val="en-US"/>
+        </w:rPr>
+        <w:t>start_</w:t>
+      </w:r>
+      <w:proofErr w:type="gramStart"/>
+      <w:r>
+        <w:rPr>
+          <w:lang w:val="en-US"/>
+        </w:rPr>
+        <w:t>session</w:t>
+      </w:r>
+      <w:proofErr w:type="spellEnd"/>
+      <w:r>
+        <w:rPr>
+          <w:lang w:val="en-US"/>
+        </w:rPr>
+        <w:t>(</w:t>
+      </w:r>
+      <w:proofErr w:type="spellStart"/>
+      <w:proofErr w:type="gramEnd"/>
+      <w:r>
+        <w:rPr>
+          <w:lang w:val="en-US"/>
+        </w:rPr>
+        <w:t>user</w:t>
+      </w:r>
+      <w:r>
+        <w:rPr>
+          <w:lang w:val="en-US"/>
+        </w:rPr>
+        <w:t>_</w:t>
+      </w:r>
+      <w:r>
+        <w:rPr>
+          <w:lang w:val="en-US"/>
+        </w:rPr>
+        <w:t>id</w:t>
+      </w:r>
+      <w:proofErr w:type="spellEnd"/>
+      <w:r>
+        <w:rPr>
+          <w:lang w:val="en-US"/>
+        </w:rPr>
+        <w:t xml:space="preserve">, 'stopwatch', callback=None), </w:t>
+      </w:r>
+      <w:proofErr w:type="spellStart"/>
+      <w:r>
+        <w:rPr>
+          <w:lang w:val="en-US"/>
+        </w:rPr>
+        <w:t>stop_timer</w:t>
+      </w:r>
+      <w:proofErr w:type="spellEnd"/>
+      <w:r>
+        <w:rPr>
+          <w:lang w:val="en-US"/>
+        </w:rPr>
+        <w:t>().</w:t>
+      </w:r>
+    </w:p>
+    <w:p>
+      <w:pPr>
+        <w:numPr>
+          <w:ilvl w:val="0"/>
+          <w:numId w:val="26"/>
+        </w:numPr>
+        <w:rPr>
+          <w:lang w:val="en-US"/>
+        </w:rPr>
+      </w:pPr>
+      <w:r>
+        <w:rPr>
+          <w:b/>
+          <w:bCs/>
+        </w:rPr>
+        <w:t>Проверки</w:t>
+      </w:r>
+      <w:r>
+        <w:rPr>
+          <w:b/>
+          <w:bCs/>
+          <w:lang w:val="en-US"/>
+        </w:rPr>
+        <w:t>:</w:t>
+      </w:r>
+      <w:r>
+        <w:rPr>
+          <w:lang w:val="en-US"/>
+        </w:rPr>
+        <w:t xml:space="preserve"> </w:t>
+      </w:r>
+      <w:r>
+        <w:t>Сессий</w:t>
+      </w:r>
+      <w:r>
+        <w:rPr>
+          <w:lang w:val="en-US"/>
+        </w:rPr>
+        <w:t xml:space="preserve"> </w:t>
+      </w:r>
+      <w:r>
+        <w:t>в</w:t>
+      </w:r>
+      <w:r>
+        <w:rPr>
+          <w:lang w:val="en-US"/>
+        </w:rPr>
+        <w:t xml:space="preserve"> </w:t>
+      </w:r>
+      <w:r>
+        <w:t>БД</w:t>
+      </w:r>
+      <w:r>
+        <w:rPr>
+          <w:lang w:val="en-US"/>
+        </w:rPr>
+        <w:t xml:space="preserve"> = 140; </w:t>
+      </w:r>
+      <w:proofErr w:type="spellStart"/>
+      <w:proofErr w:type="gramStart"/>
+      <w:r>
+        <w:rPr>
+          <w:lang w:val="en-US"/>
+        </w:rPr>
+        <w:t>timer.running</w:t>
+      </w:r>
+      <w:proofErr w:type="spellEnd"/>
+      <w:proofErr w:type="gramEnd"/>
+      <w:r>
+        <w:rPr>
+          <w:lang w:val="en-US"/>
+        </w:rPr>
+        <w:t xml:space="preserve"> = False; jobs </w:t>
+      </w:r>
+      <w:r>
+        <w:t>в</w:t>
+      </w:r>
+      <w:r>
+        <w:rPr>
+          <w:lang w:val="en-US"/>
+        </w:rPr>
+        <w:t xml:space="preserve"> scheduler = 0; </w:t>
+      </w:r>
+      <w:r>
+        <w:t>время</w:t>
+      </w:r>
+      <w:r>
+        <w:rPr>
+          <w:lang w:val="en-US"/>
+        </w:rPr>
+        <w:t xml:space="preserve"> ≤ 15 </w:t>
+      </w:r>
+      <w:r>
+        <w:t>сек</w:t>
+      </w:r>
+    </w:p>
+    <w:p>
+      <w:pPr>
+        <w:ind w:left="720"/>
+        <w:rPr>
+          <w:lang w:val="en-US"/>
+        </w:rPr>
+      </w:pPr>
+    </w:p>
+    <w:p>
+      <w:pPr>
         <w:numPr>
           <w:ilvl w:val="0"/>
           <w:numId w:val="10"/>
         </w:numPr>
       </w:pPr>
       <w:r>
-        <w:lastRenderedPageBreak/>
         <w:t>Проверка восстановления после временного сбоя внешних API (цитаты, время, расписание) и последующего возврата к нормальному режиму работы.</w:t>
+      </w:r>
+    </w:p>
+    <w:p>
+      <w:pPr>
+        <w:ind w:left="720"/>
+      </w:pPr>
+      <w:r>
+        <w:rPr>
+          <w:b/>
+          <w:bCs/>
+        </w:rPr>
+        <w:t>Предусловия:</w:t>
+      </w:r>
+      <w:r>
+        <w:t xml:space="preserve"> </w:t>
+      </w:r>
+      <w:proofErr w:type="spellStart"/>
+      <w:r>
+        <w:t>system_auth</w:t>
+      </w:r>
+      <w:proofErr w:type="spellEnd"/>
+      <w:r>
+        <w:t xml:space="preserve">, </w:t>
+      </w:r>
+      <w:proofErr w:type="spellStart"/>
+      <w:r>
+        <w:t>system_timer</w:t>
+      </w:r>
+      <w:proofErr w:type="spellEnd"/>
+      <w:r>
+        <w:t xml:space="preserve">, </w:t>
+      </w:r>
+      <w:proofErr w:type="spellStart"/>
+      <w:r>
+        <w:t>system_db</w:t>
+      </w:r>
+      <w:proofErr w:type="spellEnd"/>
+      <w:r>
+        <w:t xml:space="preserve"> доступны; мок </w:t>
+      </w:r>
+      <w:proofErr w:type="spellStart"/>
+      <w:r>
+        <w:t>requests.get</w:t>
+      </w:r>
+      <w:proofErr w:type="spellEnd"/>
+      <w:r>
+        <w:t xml:space="preserve"> с первым таймаутом, затем нормальный ответ ('2026-04-01 10:20:30').</w:t>
+      </w:r>
+    </w:p>
+    <w:p>
+      <w:pPr>
+        <w:ind w:left="720"/>
+      </w:pPr>
+      <w:r>
+        <w:rPr>
+          <w:b/>
+          <w:bCs/>
+        </w:rPr>
+        <w:t>Шаги:</w:t>
+      </w:r>
+    </w:p>
+    <w:p>
+      <w:pPr>
+        <w:numPr>
+          <w:ilvl w:val="0"/>
+          <w:numId w:val="27"/>
+        </w:numPr>
+      </w:pPr>
+      <w:r>
+        <w:t xml:space="preserve">Применить </w:t>
+      </w:r>
+      <w:proofErr w:type="spellStart"/>
+      <w:r>
+        <w:t>patch</w:t>
+      </w:r>
+      <w:proofErr w:type="spellEnd"/>
+      <w:r>
+        <w:t xml:space="preserve"> на </w:t>
+      </w:r>
+      <w:proofErr w:type="spellStart"/>
+      <w:r>
+        <w:t>requests.get</w:t>
+      </w:r>
+      <w:proofErr w:type="spellEnd"/>
+      <w:r>
+        <w:t xml:space="preserve"> с </w:t>
+      </w:r>
+      <w:proofErr w:type="spellStart"/>
+      <w:r>
+        <w:t>side_effect</w:t>
+      </w:r>
+      <w:proofErr w:type="spellEnd"/>
+      <w:r>
+        <w:t xml:space="preserve"> (таймаут → успех).</w:t>
+      </w:r>
+    </w:p>
+    <w:p>
+      <w:pPr>
+        <w:numPr>
+          <w:ilvl w:val="0"/>
+          <w:numId w:val="27"/>
+        </w:numPr>
+        <w:rPr>
+          <w:lang w:val="en-US"/>
+        </w:rPr>
+      </w:pPr>
+      <w:r>
+        <w:t>Вызвать</w:t>
+      </w:r>
+      <w:r>
+        <w:rPr>
+          <w:lang w:val="en-US"/>
+        </w:rPr>
+        <w:t xml:space="preserve"> </w:t>
+      </w:r>
+      <w:proofErr w:type="spellStart"/>
+      <w:r>
+        <w:rPr>
+          <w:lang w:val="en-US"/>
+        </w:rPr>
+        <w:t>WorldTimeAPI.get_formatted_</w:t>
+      </w:r>
+      <w:proofErr w:type="gramStart"/>
+      <w:r>
+        <w:rPr>
+          <w:lang w:val="en-US"/>
+        </w:rPr>
+        <w:t>time</w:t>
+      </w:r>
+      <w:proofErr w:type="spellEnd"/>
+      <w:r>
+        <w:rPr>
+          <w:lang w:val="en-US"/>
+        </w:rPr>
+        <w:t>(</w:t>
+      </w:r>
+      <w:proofErr w:type="gramEnd"/>
+      <w:r>
+        <w:rPr>
+          <w:lang w:val="en-US"/>
+        </w:rPr>
+        <w:t xml:space="preserve">) (fallback </w:t>
+      </w:r>
+      <w:r>
+        <w:t>и</w:t>
+      </w:r>
+      <w:r>
+        <w:rPr>
+          <w:lang w:val="en-US"/>
+        </w:rPr>
+        <w:t xml:space="preserve"> recovery).</w:t>
+      </w:r>
+    </w:p>
+    <w:p>
+      <w:pPr>
+        <w:numPr>
+          <w:ilvl w:val="0"/>
+          <w:numId w:val="27"/>
+        </w:numPr>
+        <w:rPr>
+          <w:lang w:val="en-US"/>
+        </w:rPr>
+      </w:pPr>
+      <w:r>
+        <w:t>Зарегистрировать</w:t>
+      </w:r>
+      <w:r>
+        <w:rPr>
+          <w:lang w:val="en-US"/>
+        </w:rPr>
+        <w:t>/</w:t>
+      </w:r>
+      <w:proofErr w:type="spellStart"/>
+      <w:r>
+        <w:t>залогинить</w:t>
+      </w:r>
+      <w:proofErr w:type="spellEnd"/>
+      <w:r>
+        <w:rPr>
+          <w:lang w:val="en-US"/>
+        </w:rPr>
+        <w:t xml:space="preserve"> '</w:t>
+      </w:r>
+      <w:proofErr w:type="spellStart"/>
+      <w:r>
+        <w:rPr>
+          <w:lang w:val="en-US"/>
+        </w:rPr>
+        <w:t>recovery</w:t>
+      </w:r>
+      <w:r>
+        <w:rPr>
+          <w:lang w:val="en-US"/>
+        </w:rPr>
+        <w:t>_</w:t>
+      </w:r>
+      <w:r>
+        <w:rPr>
+          <w:lang w:val="en-US"/>
+        </w:rPr>
+        <w:t>user</w:t>
+      </w:r>
+      <w:proofErr w:type="spellEnd"/>
+      <w:r>
+        <w:rPr>
+          <w:lang w:val="en-US"/>
+        </w:rPr>
+        <w:t xml:space="preserve">'; </w:t>
+      </w:r>
+      <w:proofErr w:type="spellStart"/>
+      <w:r>
+        <w:rPr>
+          <w:lang w:val="en-US"/>
+        </w:rPr>
+        <w:t>start_session</w:t>
+      </w:r>
+      <w:proofErr w:type="spellEnd"/>
+      <w:r>
+        <w:rPr>
+          <w:lang w:val="en-US"/>
+        </w:rPr>
+        <w:t>/</w:t>
+      </w:r>
+      <w:proofErr w:type="spellStart"/>
+      <w:r>
+        <w:rPr>
+          <w:lang w:val="en-US"/>
+        </w:rPr>
+        <w:t>stop_timer</w:t>
+      </w:r>
+      <w:proofErr w:type="spellEnd"/>
+      <w:r>
+        <w:rPr>
+          <w:lang w:val="en-US"/>
+        </w:rPr>
+        <w:t>(</w:t>
+      </w:r>
+      <w:proofErr w:type="spellStart"/>
+      <w:r>
+        <w:rPr>
+          <w:lang w:val="en-US"/>
+        </w:rPr>
+        <w:t>userid</w:t>
+      </w:r>
+      <w:proofErr w:type="spellEnd"/>
+      <w:r>
+        <w:rPr>
+          <w:lang w:val="en-US"/>
+        </w:rPr>
+        <w:t>).</w:t>
+      </w:r>
+    </w:p>
+    <w:p>
+      <w:pPr>
+        <w:numPr>
+          <w:ilvl w:val="0"/>
+          <w:numId w:val="27"/>
+        </w:numPr>
+      </w:pPr>
+      <w:r>
+        <w:rPr>
+          <w:b/>
+          <w:bCs/>
+        </w:rPr>
+        <w:t>Проверки:</w:t>
+      </w:r>
+      <w:r>
+        <w:t xml:space="preserve"> </w:t>
+      </w:r>
+      <w:r>
+        <w:rPr>
+          <w:lang w:val="en-US"/>
+        </w:rPr>
+        <w:t>Fallback</w:t>
+      </w:r>
+      <w:r>
+        <w:t xml:space="preserve">-время длина=19; </w:t>
+      </w:r>
+      <w:r>
+        <w:rPr>
+          <w:lang w:val="en-US"/>
+        </w:rPr>
+        <w:t>recovered</w:t>
+      </w:r>
+      <w:r>
+        <w:t>='2026-04-01 10:20:30'; сессий=1.</w:t>
+      </w:r>
+    </w:p>
+    <w:p>
+      <w:pPr>
+        <w:jc w:val="left"/>
+      </w:pPr>
+      <w:r>
+        <w:br w:type="page"/>
       </w:r>
     </w:p>
     <w:p>
@@ -5550,8 +6491,256 @@
         </w:numPr>
       </w:pPr>
       <w:r>
+        <w:lastRenderedPageBreak/>
         <w:t>Проверка объёмных данных при большом количестве сессий в одном месяце и корректной фильтрации по месяцу и году.</w:t>
       </w:r>
+    </w:p>
+    <w:p>
+      <w:pPr>
+        <w:ind w:left="720"/>
+      </w:pPr>
+      <w:r>
+        <w:rPr>
+          <w:b/>
+          <w:bCs/>
+        </w:rPr>
+        <w:t>Предусловия:</w:t>
+      </w:r>
+      <w:r>
+        <w:t xml:space="preserve"> </w:t>
+      </w:r>
+      <w:proofErr w:type="spellStart"/>
+      <w:r>
+        <w:t>system</w:t>
+      </w:r>
+      <w:r>
+        <w:t>_</w:t>
+      </w:r>
+      <w:r>
+        <w:t>auth</w:t>
+      </w:r>
+      <w:proofErr w:type="spellEnd"/>
+      <w:r>
+        <w:t xml:space="preserve">, </w:t>
+      </w:r>
+      <w:proofErr w:type="spellStart"/>
+      <w:r>
+        <w:t>system</w:t>
+      </w:r>
+      <w:r>
+        <w:t>_</w:t>
+      </w:r>
+      <w:r>
+        <w:t>db</w:t>
+      </w:r>
+      <w:proofErr w:type="spellEnd"/>
+      <w:r>
+        <w:t xml:space="preserve"> доступны; таблицы сессий пусты; пользователь '</w:t>
+      </w:r>
+      <w:proofErr w:type="spellStart"/>
+      <w:r>
+        <w:t>volume</w:t>
+      </w:r>
+      <w:r>
+        <w:t>_</w:t>
+      </w:r>
+      <w:r>
+        <w:t>user</w:t>
+      </w:r>
+      <w:proofErr w:type="spellEnd"/>
+      <w:r>
+        <w:t>' не существует.</w:t>
+      </w:r>
+    </w:p>
+    <w:p>
+      <w:pPr>
+        <w:ind w:left="720"/>
+      </w:pPr>
+      <w:r>
+        <w:rPr>
+          <w:b/>
+          <w:bCs/>
+        </w:rPr>
+        <w:t>Шаги:</w:t>
+      </w:r>
+    </w:p>
+    <w:p>
+      <w:pPr>
+        <w:numPr>
+          <w:ilvl w:val="0"/>
+          <w:numId w:val="28"/>
+        </w:numPr>
+      </w:pPr>
+      <w:r>
+        <w:t>Зарегистрировать/</w:t>
+      </w:r>
+      <w:proofErr w:type="spellStart"/>
+      <w:r>
+        <w:t>залогинить</w:t>
+      </w:r>
+      <w:proofErr w:type="spellEnd"/>
+      <w:r>
+        <w:t xml:space="preserve"> '</w:t>
+      </w:r>
+      <w:proofErr w:type="spellStart"/>
+      <w:r>
+        <w:t>volume</w:t>
+      </w:r>
+      <w:r>
+        <w:t>_</w:t>
+      </w:r>
+      <w:r>
+        <w:t>user</w:t>
+      </w:r>
+      <w:proofErr w:type="spellEnd"/>
+      <w:r>
+        <w:t>'.</w:t>
+      </w:r>
+    </w:p>
+    <w:p>
+      <w:pPr>
+        <w:numPr>
+          <w:ilvl w:val="0"/>
+          <w:numId w:val="28"/>
+        </w:numPr>
+      </w:pPr>
+      <w:r>
+        <w:t xml:space="preserve">Измерить вставку; в цикле 1200 раз: </w:t>
+      </w:r>
+      <w:proofErr w:type="spellStart"/>
+      <w:r>
+        <w:t>create_</w:t>
+      </w:r>
+      <w:proofErr w:type="gramStart"/>
+      <w:r>
+        <w:t>session</w:t>
+      </w:r>
+      <w:proofErr w:type="spellEnd"/>
+      <w:r>
+        <w:t>(</w:t>
+      </w:r>
+      <w:proofErr w:type="spellStart"/>
+      <w:proofErr w:type="gramEnd"/>
+      <w:r>
+        <w:t>user</w:t>
+      </w:r>
+      <w:r>
+        <w:t>_</w:t>
+      </w:r>
+      <w:r>
+        <w:t>id</w:t>
+      </w:r>
+      <w:proofErr w:type="spellEnd"/>
+      <w:r>
+        <w:t xml:space="preserve">, </w:t>
+      </w:r>
+      <w:proofErr w:type="spellStart"/>
+      <w:r>
+        <w:t>timestamp</w:t>
+      </w:r>
+      <w:proofErr w:type="spellEnd"/>
+      <w:r>
+        <w:t xml:space="preserve"> март/апрель 2026, '</w:t>
+      </w:r>
+      <w:proofErr w:type="spellStart"/>
+      <w:r>
+        <w:t>pomodoro</w:t>
+      </w:r>
+      <w:proofErr w:type="spellEnd"/>
+      <w:r>
+        <w:t>').</w:t>
+      </w:r>
+    </w:p>
+    <w:p>
+      <w:pPr>
+        <w:numPr>
+          <w:ilvl w:val="0"/>
+          <w:numId w:val="28"/>
+        </w:numPr>
+        <w:rPr>
+          <w:lang w:val="en-US"/>
+        </w:rPr>
+      </w:pPr>
+      <w:r>
+        <w:t>Измерить</w:t>
+      </w:r>
+      <w:r>
+        <w:rPr>
+          <w:lang w:val="en-US"/>
+        </w:rPr>
+        <w:t xml:space="preserve"> </w:t>
+      </w:r>
+      <w:r>
+        <w:t>запрос</w:t>
+      </w:r>
+      <w:r>
+        <w:rPr>
+          <w:lang w:val="en-US"/>
+        </w:rPr>
+        <w:t xml:space="preserve">: </w:t>
+      </w:r>
+      <w:proofErr w:type="spellStart"/>
+      <w:r>
+        <w:rPr>
+          <w:lang w:val="en-US"/>
+        </w:rPr>
+        <w:t>get_month_</w:t>
+      </w:r>
+      <w:proofErr w:type="gramStart"/>
+      <w:r>
+        <w:rPr>
+          <w:lang w:val="en-US"/>
+        </w:rPr>
+        <w:t>sessions</w:t>
+      </w:r>
+      <w:proofErr w:type="spellEnd"/>
+      <w:r>
+        <w:rPr>
+          <w:lang w:val="en-US"/>
+        </w:rPr>
+        <w:t>(</w:t>
+      </w:r>
+      <w:proofErr w:type="spellStart"/>
+      <w:proofErr w:type="gramEnd"/>
+      <w:r>
+        <w:rPr>
+          <w:lang w:val="en-US"/>
+        </w:rPr>
+        <w:t>userid</w:t>
+      </w:r>
+      <w:proofErr w:type="spellEnd"/>
+      <w:r>
+        <w:rPr>
+          <w:lang w:val="en-US"/>
+        </w:rPr>
+        <w:t>, 3/4, 2026).</w:t>
+      </w:r>
+    </w:p>
+    <w:p>
+      <w:pPr>
+        <w:numPr>
+          <w:ilvl w:val="0"/>
+          <w:numId w:val="28"/>
+        </w:numPr>
+      </w:pPr>
+      <w:r>
+        <w:rPr>
+          <w:b/>
+          <w:bCs/>
+        </w:rPr>
+        <w:t>Проверки:</w:t>
+      </w:r>
+      <w:r>
+        <w:t xml:space="preserve"> </w:t>
+      </w:r>
+      <w:r>
+        <w:t>Март=600 сессий, апрель=600; вставка ≤12 сек, запрос ≤3 сек</w:t>
+      </w:r>
+    </w:p>
+    <w:p>
+      <w:pPr>
+        <w:ind w:left="720"/>
+      </w:pPr>
     </w:p>
     <w:p>
       <w:pPr>
@@ -5578,6 +6767,283 @@
       </w:r>
     </w:p>
     <w:p>
+      <w:pPr>
+        <w:ind w:left="720"/>
+      </w:pPr>
+      <w:r>
+        <w:rPr>
+          <w:b/>
+          <w:bCs/>
+        </w:rPr>
+        <w:t>Предусловия:</w:t>
+      </w:r>
+      <w:r>
+        <w:t xml:space="preserve"> </w:t>
+      </w:r>
+      <w:proofErr w:type="spellStart"/>
+      <w:r>
+        <w:t>system_auth</w:t>
+      </w:r>
+      <w:proofErr w:type="spellEnd"/>
+      <w:r>
+        <w:t xml:space="preserve">, </w:t>
+      </w:r>
+      <w:proofErr w:type="spellStart"/>
+      <w:r>
+        <w:t>system_timer</w:t>
+      </w:r>
+      <w:proofErr w:type="spellEnd"/>
+      <w:r>
+        <w:t xml:space="preserve">, </w:t>
+      </w:r>
+      <w:proofErr w:type="spellStart"/>
+      <w:r>
+        <w:t>system_db</w:t>
+      </w:r>
+      <w:proofErr w:type="spellEnd"/>
+      <w:r>
+        <w:t xml:space="preserve"> доступны; пользователь '</w:t>
+      </w:r>
+      <w:proofErr w:type="spellStart"/>
+      <w:r>
+        <w:t>recover_auth_user</w:t>
+      </w:r>
+      <w:proofErr w:type="spellEnd"/>
+      <w:r>
+        <w:t>' не существует.</w:t>
+      </w:r>
+    </w:p>
+    <w:p>
+      <w:pPr>
+        <w:ind w:left="720"/>
+      </w:pPr>
+      <w:r>
+        <w:rPr>
+          <w:b/>
+          <w:bCs/>
+        </w:rPr>
+        <w:t>Шаги:</w:t>
+      </w:r>
+    </w:p>
+    <w:p>
+      <w:pPr>
+        <w:numPr>
+          <w:ilvl w:val="0"/>
+          <w:numId w:val="29"/>
+        </w:numPr>
+      </w:pPr>
+      <w:r>
+        <w:t>Зарегистрировать '</w:t>
+      </w:r>
+      <w:proofErr w:type="spellStart"/>
+      <w:r>
+        <w:t>recover_auth-user</w:t>
+      </w:r>
+      <w:proofErr w:type="spellEnd"/>
+      <w:r>
+        <w:t>' (успех).</w:t>
+      </w:r>
+    </w:p>
+    <w:p>
+      <w:pPr>
+        <w:numPr>
+          <w:ilvl w:val="0"/>
+          <w:numId w:val="29"/>
+        </w:numPr>
+      </w:pPr>
+      <w:r>
+        <w:t xml:space="preserve">Попытка </w:t>
+      </w:r>
+      <w:proofErr w:type="spellStart"/>
+      <w:r>
+        <w:t>login</w:t>
+      </w:r>
+      <w:proofErr w:type="spellEnd"/>
+      <w:r>
+        <w:t xml:space="preserve"> с </w:t>
+      </w:r>
+      <w:proofErr w:type="spellStart"/>
+      <w:r>
+        <w:t>неврным</w:t>
+      </w:r>
+      <w:proofErr w:type="spellEnd"/>
+      <w:r>
+        <w:t xml:space="preserve"> паролем (ожидается </w:t>
+      </w:r>
+      <w:proofErr w:type="spellStart"/>
+      <w:r>
+        <w:t>False</w:t>
+      </w:r>
+      <w:proofErr w:type="spellEnd"/>
+      <w:r>
+        <w:t>).</w:t>
+      </w:r>
+    </w:p>
+    <w:p>
+      <w:pPr>
+        <w:numPr>
+          <w:ilvl w:val="0"/>
+          <w:numId w:val="29"/>
+        </w:numPr>
+        <w:rPr>
+          <w:lang w:val="en-US"/>
+        </w:rPr>
+      </w:pPr>
+      <w:r>
+        <w:rPr>
+          <w:lang w:val="en-US"/>
+        </w:rPr>
+        <w:t xml:space="preserve">Login </w:t>
+      </w:r>
+      <w:r>
+        <w:t>с</w:t>
+      </w:r>
+      <w:r>
+        <w:rPr>
+          <w:lang w:val="en-US"/>
+        </w:rPr>
+        <w:t xml:space="preserve"> </w:t>
+      </w:r>
+      <w:r>
+        <w:t>верным</w:t>
+      </w:r>
+      <w:r>
+        <w:rPr>
+          <w:lang w:val="en-US"/>
+        </w:rPr>
+        <w:t xml:space="preserve"> </w:t>
+      </w:r>
+      <w:r>
+        <w:t>паролем</w:t>
+      </w:r>
+      <w:r>
+        <w:rPr>
+          <w:lang w:val="en-US"/>
+        </w:rPr>
+        <w:t xml:space="preserve">; </w:t>
+      </w:r>
+      <w:proofErr w:type="spellStart"/>
+      <w:r>
+        <w:rPr>
+          <w:lang w:val="en-US"/>
+        </w:rPr>
+        <w:t>start_session</w:t>
+      </w:r>
+      <w:proofErr w:type="spellEnd"/>
+      <w:r>
+        <w:rPr>
+          <w:lang w:val="en-US"/>
+        </w:rPr>
+        <w:t>/</w:t>
+      </w:r>
+      <w:proofErr w:type="spellStart"/>
+      <w:r>
+        <w:rPr>
+          <w:lang w:val="en-US"/>
+        </w:rPr>
+        <w:t>stop_</w:t>
+      </w:r>
+      <w:proofErr w:type="gramStart"/>
+      <w:r>
+        <w:rPr>
+          <w:lang w:val="en-US"/>
+        </w:rPr>
+        <w:t>timer</w:t>
+      </w:r>
+      <w:proofErr w:type="spellEnd"/>
+      <w:r>
+        <w:rPr>
+          <w:lang w:val="en-US"/>
+        </w:rPr>
+        <w:t>(</w:t>
+      </w:r>
+      <w:proofErr w:type="spellStart"/>
+      <w:proofErr w:type="gramEnd"/>
+      <w:r>
+        <w:rPr>
+          <w:lang w:val="en-US"/>
+        </w:rPr>
+        <w:t>userid</w:t>
+      </w:r>
+      <w:proofErr w:type="spellEnd"/>
+      <w:r>
+        <w:rPr>
+          <w:lang w:val="en-US"/>
+        </w:rPr>
+        <w:t>).</w:t>
+      </w:r>
+    </w:p>
+    <w:p>
+      <w:pPr>
+        <w:numPr>
+          <w:ilvl w:val="0"/>
+          <w:numId w:val="29"/>
+        </w:numPr>
+      </w:pPr>
+      <w:r>
+        <w:rPr>
+          <w:b/>
+          <w:bCs/>
+        </w:rPr>
+        <w:t>Проверки:</w:t>
+      </w:r>
+      <w:r>
+        <w:rPr>
+          <w:b/>
+          <w:bCs/>
+        </w:rPr>
+        <w:t xml:space="preserve"> </w:t>
+      </w:r>
+      <w:r>
+        <w:t>Регистрация=</w:t>
+      </w:r>
+      <w:proofErr w:type="spellStart"/>
+      <w:r>
+        <w:t>True</w:t>
+      </w:r>
+      <w:proofErr w:type="spellEnd"/>
+      <w:r>
+        <w:t xml:space="preserve">; </w:t>
+      </w:r>
+      <w:proofErr w:type="spellStart"/>
+      <w:r>
+        <w:t>wrong</w:t>
+      </w:r>
+      <w:proofErr w:type="spellEnd"/>
+      <w:r>
+        <w:t xml:space="preserve"> </w:t>
+      </w:r>
+      <w:proofErr w:type="spellStart"/>
+      <w:r>
+        <w:t>login</w:t>
+      </w:r>
+      <w:proofErr w:type="spellEnd"/>
+      <w:r>
+        <w:t>=</w:t>
+      </w:r>
+      <w:proofErr w:type="spellStart"/>
+      <w:r>
+        <w:t>False</w:t>
+      </w:r>
+      <w:proofErr w:type="spellEnd"/>
+      <w:r>
+        <w:t>; сессий=1 после успеха. (Для повторной регистрации/без сессии — исключения обрабатываютс</w:t>
+      </w:r>
+      <w:bookmarkStart w:id="12" w:name="_GoBack"/>
+      <w:bookmarkEnd w:id="12"/>
+      <w:r>
+        <w:t xml:space="preserve">я аналогично, без </w:t>
+      </w:r>
+      <w:proofErr w:type="spellStart"/>
+      <w:r>
+        <w:t>краша</w:t>
+      </w:r>
+      <w:proofErr w:type="spellEnd"/>
+      <w:r>
+        <w:t xml:space="preserve"> системы)</w:t>
+      </w:r>
+    </w:p>
+    <w:p>
       <w:proofErr w:type="spellStart"/>
       <w:r>
         <w:rPr>
@@ -5702,6 +7168,7 @@
         </w:numPr>
       </w:pPr>
       <w:r>
+        <w:lastRenderedPageBreak/>
         <w:t>«Позитивный» путь, включающий успешную работу внешних API (цитата, время, расписание) и отображение этих данных в пользовательском сценарии.</w:t>
       </w:r>
     </w:p>
@@ -5906,7 +7373,7 @@
         <w:t xml:space="preserve">Рисунок </w:t>
       </w:r>
       <w:r>
-        <w:t>8</w:t>
+        <w:t>11</w:t>
       </w:r>
       <w:r>
         <w:t xml:space="preserve">. Результаты </w:t>
@@ -5972,7 +7439,7 @@
         <w:t xml:space="preserve">Рисунок </w:t>
       </w:r>
       <w:r>
-        <w:t>9</w:t>
+        <w:t>12</w:t>
       </w:r>
       <w:r>
         <w:t>. Результаты системного тестирования</w:t>
@@ -6083,6 +7550,453 @@
 <file path=word/numbering.xml><?xml version="1.0" encoding="utf-8"?>
 <w:numbering xmlns:wpc="http://schemas.microsoft.com/office/word/2010/wordprocessingCanvas" xmlns:cx="http://schemas.microsoft.com/office/drawing/2014/chartex" xmlns:cx1="http://schemas.microsoft.com/office/drawing/2015/9/8/chartex" xmlns:mc="http://schemas.openxmlformats.org/markup-compatibility/2006" xmlns:o="urn:schemas-microsoft-com:office:office" xmlns:r="http://schemas.openxmlformats.org/officeDocument/2006/relationships" xmlns:m="http://schemas.openxmlformats.org/officeDocument/2006/math" xmlns:v="urn:schemas-microsoft-com:vml" xmlns:wp14="http://schemas.microsoft.com/office/word/2010/wordprocessingDrawing" xmlns:wp="http://schemas.openxmlformats.org/drawingml/2006/wordprocessingDrawing" xmlns:w10="urn:schemas-microsoft-com:office:word" xmlns:w="http://schemas.openxmlformats.org/wordprocessingml/2006/main" xmlns:w14="http://schemas.microsoft.com/office/word/2010/wordml" xmlns:w15="http://schemas.microsoft.com/office/word/2012/wordml" xmlns:w16se="http://schemas.microsoft.com/office/word/2015/wordml/symex" xmlns:wpg="http://schemas.microsoft.com/office/word/2010/wordprocessingGroup" xmlns:wpi="http://schemas.microsoft.com/office/word/2010/wordprocessingInk" xmlns:wne="http://schemas.microsoft.com/office/word/2006/wordml" xmlns:wps="http://schemas.microsoft.com/office/word/2010/wordprocessingShape" mc:Ignorable="w14 w15 w16se wp14">
   <w:abstractNum w:abstractNumId="0" w15:restartNumberingAfterBreak="0">
+    <w:nsid w:val="09E30838"/>
+    <w:multiLevelType w:val="multilevel"/>
+    <w:tmpl w:val="DDC45F16"/>
+    <w:lvl w:ilvl="0">
+      <w:start w:val="1"/>
+      <w:numFmt w:val="bullet"/>
+      <w:lvlText w:val=""/>
+      <w:lvlJc w:val="left"/>
+      <w:pPr>
+        <w:tabs>
+          <w:tab w:val="num" w:pos="720"/>
+        </w:tabs>
+        <w:ind w:left="720" w:hanging="360"/>
+      </w:pPr>
+      <w:rPr>
+        <w:rFonts w:ascii="Symbol" w:hAnsi="Symbol" w:hint="default"/>
+        <w:sz w:val="20"/>
+      </w:rPr>
+    </w:lvl>
+    <w:lvl w:ilvl="1" w:tentative="1">
+      <w:start w:val="1"/>
+      <w:numFmt w:val="bullet"/>
+      <w:lvlText w:val=""/>
+      <w:lvlJc w:val="left"/>
+      <w:pPr>
+        <w:tabs>
+          <w:tab w:val="num" w:pos="1440"/>
+        </w:tabs>
+        <w:ind w:left="1440" w:hanging="360"/>
+      </w:pPr>
+      <w:rPr>
+        <w:rFonts w:ascii="Symbol" w:hAnsi="Symbol" w:hint="default"/>
+        <w:sz w:val="20"/>
+      </w:rPr>
+    </w:lvl>
+    <w:lvl w:ilvl="2" w:tentative="1">
+      <w:start w:val="1"/>
+      <w:numFmt w:val="bullet"/>
+      <w:lvlText w:val=""/>
+      <w:lvlJc w:val="left"/>
+      <w:pPr>
+        <w:tabs>
+          <w:tab w:val="num" w:pos="2160"/>
+        </w:tabs>
+        <w:ind w:left="2160" w:hanging="360"/>
+      </w:pPr>
+      <w:rPr>
+        <w:rFonts w:ascii="Symbol" w:hAnsi="Symbol" w:hint="default"/>
+        <w:sz w:val="20"/>
+      </w:rPr>
+    </w:lvl>
+    <w:lvl w:ilvl="3" w:tentative="1">
+      <w:start w:val="1"/>
+      <w:numFmt w:val="bullet"/>
+      <w:lvlText w:val=""/>
+      <w:lvlJc w:val="left"/>
+      <w:pPr>
+        <w:tabs>
+          <w:tab w:val="num" w:pos="2880"/>
+        </w:tabs>
+        <w:ind w:left="2880" w:hanging="360"/>
+      </w:pPr>
+      <w:rPr>
+        <w:rFonts w:ascii="Symbol" w:hAnsi="Symbol" w:hint="default"/>
+        <w:sz w:val="20"/>
+      </w:rPr>
+    </w:lvl>
+    <w:lvl w:ilvl="4" w:tentative="1">
+      <w:start w:val="1"/>
+      <w:numFmt w:val="bullet"/>
+      <w:lvlText w:val=""/>
+      <w:lvlJc w:val="left"/>
+      <w:pPr>
+        <w:tabs>
+          <w:tab w:val="num" w:pos="3600"/>
+        </w:tabs>
+        <w:ind w:left="3600" w:hanging="360"/>
+      </w:pPr>
+      <w:rPr>
+        <w:rFonts w:ascii="Symbol" w:hAnsi="Symbol" w:hint="default"/>
+        <w:sz w:val="20"/>
+      </w:rPr>
+    </w:lvl>
+    <w:lvl w:ilvl="5" w:tentative="1">
+      <w:start w:val="1"/>
+      <w:numFmt w:val="bullet"/>
+      <w:lvlText w:val=""/>
+      <w:lvlJc w:val="left"/>
+      <w:pPr>
+        <w:tabs>
+          <w:tab w:val="num" w:pos="4320"/>
+        </w:tabs>
+        <w:ind w:left="4320" w:hanging="360"/>
+      </w:pPr>
+      <w:rPr>
+        <w:rFonts w:ascii="Symbol" w:hAnsi="Symbol" w:hint="default"/>
+        <w:sz w:val="20"/>
+      </w:rPr>
+    </w:lvl>
+    <w:lvl w:ilvl="6" w:tentative="1">
+      <w:start w:val="1"/>
+      <w:numFmt w:val="bullet"/>
+      <w:lvlText w:val=""/>
+      <w:lvlJc w:val="left"/>
+      <w:pPr>
+        <w:tabs>
+          <w:tab w:val="num" w:pos="5040"/>
+        </w:tabs>
+        <w:ind w:left="5040" w:hanging="360"/>
+      </w:pPr>
+      <w:rPr>
+        <w:rFonts w:ascii="Symbol" w:hAnsi="Symbol" w:hint="default"/>
+        <w:sz w:val="20"/>
+      </w:rPr>
+    </w:lvl>
+    <w:lvl w:ilvl="7" w:tentative="1">
+      <w:start w:val="1"/>
+      <w:numFmt w:val="bullet"/>
+      <w:lvlText w:val=""/>
+      <w:lvlJc w:val="left"/>
+      <w:pPr>
+        <w:tabs>
+          <w:tab w:val="num" w:pos="5760"/>
+        </w:tabs>
+        <w:ind w:left="5760" w:hanging="360"/>
+      </w:pPr>
+      <w:rPr>
+        <w:rFonts w:ascii="Symbol" w:hAnsi="Symbol" w:hint="default"/>
+        <w:sz w:val="20"/>
+      </w:rPr>
+    </w:lvl>
+    <w:lvl w:ilvl="8" w:tentative="1">
+      <w:start w:val="1"/>
+      <w:numFmt w:val="bullet"/>
+      <w:lvlText w:val=""/>
+      <w:lvlJc w:val="left"/>
+      <w:pPr>
+        <w:tabs>
+          <w:tab w:val="num" w:pos="6480"/>
+        </w:tabs>
+        <w:ind w:left="6480" w:hanging="360"/>
+      </w:pPr>
+      <w:rPr>
+        <w:rFonts w:ascii="Symbol" w:hAnsi="Symbol" w:hint="default"/>
+        <w:sz w:val="20"/>
+      </w:rPr>
+    </w:lvl>
+  </w:abstractNum>
+  <w:abstractNum w:abstractNumId="1" w15:restartNumberingAfterBreak="0">
+    <w:nsid w:val="10525DF9"/>
+    <w:multiLevelType w:val="multilevel"/>
+    <w:tmpl w:val="B1E676C0"/>
+    <w:lvl w:ilvl="0">
+      <w:start w:val="1"/>
+      <w:numFmt w:val="bullet"/>
+      <w:lvlText w:val=""/>
+      <w:lvlJc w:val="left"/>
+      <w:pPr>
+        <w:tabs>
+          <w:tab w:val="num" w:pos="720"/>
+        </w:tabs>
+        <w:ind w:left="720" w:hanging="360"/>
+      </w:pPr>
+      <w:rPr>
+        <w:rFonts w:ascii="Symbol" w:hAnsi="Symbol" w:hint="default"/>
+        <w:sz w:val="20"/>
+      </w:rPr>
+    </w:lvl>
+    <w:lvl w:ilvl="1" w:tentative="1">
+      <w:start w:val="1"/>
+      <w:numFmt w:val="bullet"/>
+      <w:lvlText w:val=""/>
+      <w:lvlJc w:val="left"/>
+      <w:pPr>
+        <w:tabs>
+          <w:tab w:val="num" w:pos="1440"/>
+        </w:tabs>
+        <w:ind w:left="1440" w:hanging="360"/>
+      </w:pPr>
+      <w:rPr>
+        <w:rFonts w:ascii="Symbol" w:hAnsi="Symbol" w:hint="default"/>
+        <w:sz w:val="20"/>
+      </w:rPr>
+    </w:lvl>
+    <w:lvl w:ilvl="2" w:tentative="1">
+      <w:start w:val="1"/>
+      <w:numFmt w:val="bullet"/>
+      <w:lvlText w:val=""/>
+      <w:lvlJc w:val="left"/>
+      <w:pPr>
+        <w:tabs>
+          <w:tab w:val="num" w:pos="2160"/>
+        </w:tabs>
+        <w:ind w:left="2160" w:hanging="360"/>
+      </w:pPr>
+      <w:rPr>
+        <w:rFonts w:ascii="Symbol" w:hAnsi="Symbol" w:hint="default"/>
+        <w:sz w:val="20"/>
+      </w:rPr>
+    </w:lvl>
+    <w:lvl w:ilvl="3" w:tentative="1">
+      <w:start w:val="1"/>
+      <w:numFmt w:val="bullet"/>
+      <w:lvlText w:val=""/>
+      <w:lvlJc w:val="left"/>
+      <w:pPr>
+        <w:tabs>
+          <w:tab w:val="num" w:pos="2880"/>
+        </w:tabs>
+        <w:ind w:left="2880" w:hanging="360"/>
+      </w:pPr>
+      <w:rPr>
+        <w:rFonts w:ascii="Symbol" w:hAnsi="Symbol" w:hint="default"/>
+        <w:sz w:val="20"/>
+      </w:rPr>
+    </w:lvl>
+    <w:lvl w:ilvl="4" w:tentative="1">
+      <w:start w:val="1"/>
+      <w:numFmt w:val="bullet"/>
+      <w:lvlText w:val=""/>
+      <w:lvlJc w:val="left"/>
+      <w:pPr>
+        <w:tabs>
+          <w:tab w:val="num" w:pos="3600"/>
+        </w:tabs>
+        <w:ind w:left="3600" w:hanging="360"/>
+      </w:pPr>
+      <w:rPr>
+        <w:rFonts w:ascii="Symbol" w:hAnsi="Symbol" w:hint="default"/>
+        <w:sz w:val="20"/>
+      </w:rPr>
+    </w:lvl>
+    <w:lvl w:ilvl="5" w:tentative="1">
+      <w:start w:val="1"/>
+      <w:numFmt w:val="bullet"/>
+      <w:lvlText w:val=""/>
+      <w:lvlJc w:val="left"/>
+      <w:pPr>
+        <w:tabs>
+          <w:tab w:val="num" w:pos="4320"/>
+        </w:tabs>
+        <w:ind w:left="4320" w:hanging="360"/>
+      </w:pPr>
+      <w:rPr>
+        <w:rFonts w:ascii="Symbol" w:hAnsi="Symbol" w:hint="default"/>
+        <w:sz w:val="20"/>
+      </w:rPr>
+    </w:lvl>
+    <w:lvl w:ilvl="6" w:tentative="1">
+      <w:start w:val="1"/>
+      <w:numFmt w:val="bullet"/>
+      <w:lvlText w:val=""/>
+      <w:lvlJc w:val="left"/>
+      <w:pPr>
+        <w:tabs>
+          <w:tab w:val="num" w:pos="5040"/>
+        </w:tabs>
+        <w:ind w:left="5040" w:hanging="360"/>
+      </w:pPr>
+      <w:rPr>
+        <w:rFonts w:ascii="Symbol" w:hAnsi="Symbol" w:hint="default"/>
+        <w:sz w:val="20"/>
+      </w:rPr>
+    </w:lvl>
+    <w:lvl w:ilvl="7" w:tentative="1">
+      <w:start w:val="1"/>
+      <w:numFmt w:val="bullet"/>
+      <w:lvlText w:val=""/>
+      <w:lvlJc w:val="left"/>
+      <w:pPr>
+        <w:tabs>
+          <w:tab w:val="num" w:pos="5760"/>
+        </w:tabs>
+        <w:ind w:left="5760" w:hanging="360"/>
+      </w:pPr>
+      <w:rPr>
+        <w:rFonts w:ascii="Symbol" w:hAnsi="Symbol" w:hint="default"/>
+        <w:sz w:val="20"/>
+      </w:rPr>
+    </w:lvl>
+    <w:lvl w:ilvl="8" w:tentative="1">
+      <w:start w:val="1"/>
+      <w:numFmt w:val="bullet"/>
+      <w:lvlText w:val=""/>
+      <w:lvlJc w:val="left"/>
+      <w:pPr>
+        <w:tabs>
+          <w:tab w:val="num" w:pos="6480"/>
+        </w:tabs>
+        <w:ind w:left="6480" w:hanging="360"/>
+      </w:pPr>
+      <w:rPr>
+        <w:rFonts w:ascii="Symbol" w:hAnsi="Symbol" w:hint="default"/>
+        <w:sz w:val="20"/>
+      </w:rPr>
+    </w:lvl>
+  </w:abstractNum>
+  <w:abstractNum w:abstractNumId="2" w15:restartNumberingAfterBreak="0">
+    <w:nsid w:val="16BB38E4"/>
+    <w:multiLevelType w:val="multilevel"/>
+    <w:tmpl w:val="63D8AB08"/>
+    <w:lvl w:ilvl="0">
+      <w:start w:val="1"/>
+      <w:numFmt w:val="bullet"/>
+      <w:lvlText w:val=""/>
+      <w:lvlJc w:val="left"/>
+      <w:pPr>
+        <w:tabs>
+          <w:tab w:val="num" w:pos="720"/>
+        </w:tabs>
+        <w:ind w:left="720" w:hanging="360"/>
+      </w:pPr>
+      <w:rPr>
+        <w:rFonts w:ascii="Symbol" w:hAnsi="Symbol" w:hint="default"/>
+        <w:sz w:val="20"/>
+      </w:rPr>
+    </w:lvl>
+    <w:lvl w:ilvl="1" w:tentative="1">
+      <w:start w:val="1"/>
+      <w:numFmt w:val="bullet"/>
+      <w:lvlText w:val=""/>
+      <w:lvlJc w:val="left"/>
+      <w:pPr>
+        <w:tabs>
+          <w:tab w:val="num" w:pos="1440"/>
+        </w:tabs>
+        <w:ind w:left="1440" w:hanging="360"/>
+      </w:pPr>
+      <w:rPr>
+        <w:rFonts w:ascii="Symbol" w:hAnsi="Symbol" w:hint="default"/>
+        <w:sz w:val="20"/>
+      </w:rPr>
+    </w:lvl>
+    <w:lvl w:ilvl="2" w:tentative="1">
+      <w:start w:val="1"/>
+      <w:numFmt w:val="bullet"/>
+      <w:lvlText w:val=""/>
+      <w:lvlJc w:val="left"/>
+      <w:pPr>
+        <w:tabs>
+          <w:tab w:val="num" w:pos="2160"/>
+        </w:tabs>
+        <w:ind w:left="2160" w:hanging="360"/>
+      </w:pPr>
+      <w:rPr>
+        <w:rFonts w:ascii="Symbol" w:hAnsi="Symbol" w:hint="default"/>
+        <w:sz w:val="20"/>
+      </w:rPr>
+    </w:lvl>
+    <w:lvl w:ilvl="3" w:tentative="1">
+      <w:start w:val="1"/>
+      <w:numFmt w:val="bullet"/>
+      <w:lvlText w:val=""/>
+      <w:lvlJc w:val="left"/>
+      <w:pPr>
+        <w:tabs>
+          <w:tab w:val="num" w:pos="2880"/>
+        </w:tabs>
+        <w:ind w:left="2880" w:hanging="360"/>
+      </w:pPr>
+      <w:rPr>
+        <w:rFonts w:ascii="Symbol" w:hAnsi="Symbol" w:hint="default"/>
+        <w:sz w:val="20"/>
+      </w:rPr>
+    </w:lvl>
+    <w:lvl w:ilvl="4" w:tentative="1">
+      <w:start w:val="1"/>
+      <w:numFmt w:val="bullet"/>
+      <w:lvlText w:val=""/>
+      <w:lvlJc w:val="left"/>
+      <w:pPr>
+        <w:tabs>
+          <w:tab w:val="num" w:pos="3600"/>
+        </w:tabs>
+        <w:ind w:left="3600" w:hanging="360"/>
+      </w:pPr>
+      <w:rPr>
+        <w:rFonts w:ascii="Symbol" w:hAnsi="Symbol" w:hint="default"/>
+        <w:sz w:val="20"/>
+      </w:rPr>
+    </w:lvl>
+    <w:lvl w:ilvl="5" w:tentative="1">
+      <w:start w:val="1"/>
+      <w:numFmt w:val="bullet"/>
+      <w:lvlText w:val=""/>
+      <w:lvlJc w:val="left"/>
+      <w:pPr>
+        <w:tabs>
+          <w:tab w:val="num" w:pos="4320"/>
+        </w:tabs>
+        <w:ind w:left="4320" w:hanging="360"/>
+      </w:pPr>
+      <w:rPr>
+        <w:rFonts w:ascii="Symbol" w:hAnsi="Symbol" w:hint="default"/>
+        <w:sz w:val="20"/>
+      </w:rPr>
+    </w:lvl>
+    <w:lvl w:ilvl="6" w:tentative="1">
+      <w:start w:val="1"/>
+      <w:numFmt w:val="bullet"/>
+      <w:lvlText w:val=""/>
+      <w:lvlJc w:val="left"/>
+      <w:pPr>
+        <w:tabs>
+          <w:tab w:val="num" w:pos="5040"/>
+        </w:tabs>
+        <w:ind w:left="5040" w:hanging="360"/>
+      </w:pPr>
+      <w:rPr>
+        <w:rFonts w:ascii="Symbol" w:hAnsi="Symbol" w:hint="default"/>
+        <w:sz w:val="20"/>
+      </w:rPr>
+    </w:lvl>
+    <w:lvl w:ilvl="7" w:tentative="1">
+      <w:start w:val="1"/>
+      <w:numFmt w:val="bullet"/>
+      <w:lvlText w:val=""/>
+      <w:lvlJc w:val="left"/>
+      <w:pPr>
+        <w:tabs>
+          <w:tab w:val="num" w:pos="5760"/>
+        </w:tabs>
+        <w:ind w:left="5760" w:hanging="360"/>
+      </w:pPr>
+      <w:rPr>
+        <w:rFonts w:ascii="Symbol" w:hAnsi="Symbol" w:hint="default"/>
+        <w:sz w:val="20"/>
+      </w:rPr>
+    </w:lvl>
+    <w:lvl w:ilvl="8" w:tentative="1">
+      <w:start w:val="1"/>
+      <w:numFmt w:val="bullet"/>
+      <w:lvlText w:val=""/>
+      <w:lvlJc w:val="left"/>
+      <w:pPr>
+        <w:tabs>
+          <w:tab w:val="num" w:pos="6480"/>
+        </w:tabs>
+        <w:ind w:left="6480" w:hanging="360"/>
+      </w:pPr>
+      <w:rPr>
+        <w:rFonts w:ascii="Symbol" w:hAnsi="Symbol" w:hint="default"/>
+        <w:sz w:val="20"/>
+      </w:rPr>
+    </w:lvl>
+  </w:abstractNum>
+  <w:abstractNum w:abstractNumId="3" w15:restartNumberingAfterBreak="0">
     <w:nsid w:val="1C202100"/>
     <w:multiLevelType w:val="multilevel"/>
     <w:tmpl w:val="46DA6C28"/>
@@ -6231,7 +8145,7 @@
       </w:rPr>
     </w:lvl>
   </w:abstractNum>
-  <w:abstractNum w:abstractNumId="1" w15:restartNumberingAfterBreak="0">
+  <w:abstractNum w:abstractNumId="4" w15:restartNumberingAfterBreak="0">
     <w:nsid w:val="1E8C2682"/>
     <w:multiLevelType w:val="multilevel"/>
     <w:tmpl w:val="0BBEB784"/>
@@ -6380,7 +8294,7 @@
       </w:rPr>
     </w:lvl>
   </w:abstractNum>
-  <w:abstractNum w:abstractNumId="2" w15:restartNumberingAfterBreak="0">
+  <w:abstractNum w:abstractNumId="5" w15:restartNumberingAfterBreak="0">
     <w:nsid w:val="2A721CC6"/>
     <w:multiLevelType w:val="multilevel"/>
     <w:tmpl w:val="05E0BFF4"/>
@@ -6493,7 +8407,7 @@
       </w:pPr>
     </w:lvl>
   </w:abstractNum>
-  <w:abstractNum w:abstractNumId="3" w15:restartNumberingAfterBreak="0">
+  <w:abstractNum w:abstractNumId="6" w15:restartNumberingAfterBreak="0">
     <w:nsid w:val="2D846C2A"/>
     <w:multiLevelType w:val="multilevel"/>
     <w:tmpl w:val="C588952E"/>
@@ -6606,7 +8520,7 @@
       </w:pPr>
     </w:lvl>
   </w:abstractNum>
-  <w:abstractNum w:abstractNumId="4" w15:restartNumberingAfterBreak="0">
+  <w:abstractNum w:abstractNumId="7" w15:restartNumberingAfterBreak="0">
     <w:nsid w:val="2E0B17B5"/>
     <w:multiLevelType w:val="multilevel"/>
     <w:tmpl w:val="6E8C8B78"/>
@@ -6719,7 +8633,7 @@
       </w:pPr>
     </w:lvl>
   </w:abstractNum>
-  <w:abstractNum w:abstractNumId="5" w15:restartNumberingAfterBreak="0">
+  <w:abstractNum w:abstractNumId="8" w15:restartNumberingAfterBreak="0">
     <w:nsid w:val="3559678E"/>
     <w:multiLevelType w:val="multilevel"/>
     <w:tmpl w:val="199CB718"/>
@@ -6868,7 +8782,156 @@
       </w:rPr>
     </w:lvl>
   </w:abstractNum>
-  <w:abstractNum w:abstractNumId="6" w15:restartNumberingAfterBreak="0">
+  <w:abstractNum w:abstractNumId="9" w15:restartNumberingAfterBreak="0">
+    <w:nsid w:val="367446AE"/>
+    <w:multiLevelType w:val="multilevel"/>
+    <w:tmpl w:val="8F0A14F6"/>
+    <w:lvl w:ilvl="0">
+      <w:start w:val="1"/>
+      <w:numFmt w:val="bullet"/>
+      <w:lvlText w:val=""/>
+      <w:lvlJc w:val="left"/>
+      <w:pPr>
+        <w:tabs>
+          <w:tab w:val="num" w:pos="720"/>
+        </w:tabs>
+        <w:ind w:left="720" w:hanging="360"/>
+      </w:pPr>
+      <w:rPr>
+        <w:rFonts w:ascii="Symbol" w:hAnsi="Symbol" w:hint="default"/>
+        <w:sz w:val="20"/>
+      </w:rPr>
+    </w:lvl>
+    <w:lvl w:ilvl="1" w:tentative="1">
+      <w:start w:val="1"/>
+      <w:numFmt w:val="bullet"/>
+      <w:lvlText w:val=""/>
+      <w:lvlJc w:val="left"/>
+      <w:pPr>
+        <w:tabs>
+          <w:tab w:val="num" w:pos="1440"/>
+        </w:tabs>
+        <w:ind w:left="1440" w:hanging="360"/>
+      </w:pPr>
+      <w:rPr>
+        <w:rFonts w:ascii="Symbol" w:hAnsi="Symbol" w:hint="default"/>
+        <w:sz w:val="20"/>
+      </w:rPr>
+    </w:lvl>
+    <w:lvl w:ilvl="2" w:tentative="1">
+      <w:start w:val="1"/>
+      <w:numFmt w:val="bullet"/>
+      <w:lvlText w:val=""/>
+      <w:lvlJc w:val="left"/>
+      <w:pPr>
+        <w:tabs>
+          <w:tab w:val="num" w:pos="2160"/>
+        </w:tabs>
+        <w:ind w:left="2160" w:hanging="360"/>
+      </w:pPr>
+      <w:rPr>
+        <w:rFonts w:ascii="Symbol" w:hAnsi="Symbol" w:hint="default"/>
+        <w:sz w:val="20"/>
+      </w:rPr>
+    </w:lvl>
+    <w:lvl w:ilvl="3" w:tentative="1">
+      <w:start w:val="1"/>
+      <w:numFmt w:val="bullet"/>
+      <w:lvlText w:val=""/>
+      <w:lvlJc w:val="left"/>
+      <w:pPr>
+        <w:tabs>
+          <w:tab w:val="num" w:pos="2880"/>
+        </w:tabs>
+        <w:ind w:left="2880" w:hanging="360"/>
+      </w:pPr>
+      <w:rPr>
+        <w:rFonts w:ascii="Symbol" w:hAnsi="Symbol" w:hint="default"/>
+        <w:sz w:val="20"/>
+      </w:rPr>
+    </w:lvl>
+    <w:lvl w:ilvl="4" w:tentative="1">
+      <w:start w:val="1"/>
+      <w:numFmt w:val="bullet"/>
+      <w:lvlText w:val=""/>
+      <w:lvlJc w:val="left"/>
+      <w:pPr>
+        <w:tabs>
+          <w:tab w:val="num" w:pos="3600"/>
+        </w:tabs>
+        <w:ind w:left="3600" w:hanging="360"/>
+      </w:pPr>
+      <w:rPr>
+        <w:rFonts w:ascii="Symbol" w:hAnsi="Symbol" w:hint="default"/>
+        <w:sz w:val="20"/>
+      </w:rPr>
+    </w:lvl>
+    <w:lvl w:ilvl="5" w:tentative="1">
+      <w:start w:val="1"/>
+      <w:numFmt w:val="bullet"/>
+      <w:lvlText w:val=""/>
+      <w:lvlJc w:val="left"/>
+      <w:pPr>
+        <w:tabs>
+          <w:tab w:val="num" w:pos="4320"/>
+        </w:tabs>
+        <w:ind w:left="4320" w:hanging="360"/>
+      </w:pPr>
+      <w:rPr>
+        <w:rFonts w:ascii="Symbol" w:hAnsi="Symbol" w:hint="default"/>
+        <w:sz w:val="20"/>
+      </w:rPr>
+    </w:lvl>
+    <w:lvl w:ilvl="6" w:tentative="1">
+      <w:start w:val="1"/>
+      <w:numFmt w:val="bullet"/>
+      <w:lvlText w:val=""/>
+      <w:lvlJc w:val="left"/>
+      <w:pPr>
+        <w:tabs>
+          <w:tab w:val="num" w:pos="5040"/>
+        </w:tabs>
+        <w:ind w:left="5040" w:hanging="360"/>
+      </w:pPr>
+      <w:rPr>
+        <w:rFonts w:ascii="Symbol" w:hAnsi="Symbol" w:hint="default"/>
+        <w:sz w:val="20"/>
+      </w:rPr>
+    </w:lvl>
+    <w:lvl w:ilvl="7" w:tentative="1">
+      <w:start w:val="1"/>
+      <w:numFmt w:val="bullet"/>
+      <w:lvlText w:val=""/>
+      <w:lvlJc w:val="left"/>
+      <w:pPr>
+        <w:tabs>
+          <w:tab w:val="num" w:pos="5760"/>
+        </w:tabs>
+        <w:ind w:left="5760" w:hanging="360"/>
+      </w:pPr>
+      <w:rPr>
+        <w:rFonts w:ascii="Symbol" w:hAnsi="Symbol" w:hint="default"/>
+        <w:sz w:val="20"/>
+      </w:rPr>
+    </w:lvl>
+    <w:lvl w:ilvl="8" w:tentative="1">
+      <w:start w:val="1"/>
+      <w:numFmt w:val="bullet"/>
+      <w:lvlText w:val=""/>
+      <w:lvlJc w:val="left"/>
+      <w:pPr>
+        <w:tabs>
+          <w:tab w:val="num" w:pos="6480"/>
+        </w:tabs>
+        <w:ind w:left="6480" w:hanging="360"/>
+      </w:pPr>
+      <w:rPr>
+        <w:rFonts w:ascii="Symbol" w:hAnsi="Symbol" w:hint="default"/>
+        <w:sz w:val="20"/>
+      </w:rPr>
+    </w:lvl>
+  </w:abstractNum>
+  <w:abstractNum w:abstractNumId="10" w15:restartNumberingAfterBreak="0">
     <w:nsid w:val="390371D2"/>
     <w:multiLevelType w:val="multilevel"/>
     <w:tmpl w:val="85B27076"/>
@@ -6981,7 +9044,7 @@
       </w:pPr>
     </w:lvl>
   </w:abstractNum>
-  <w:abstractNum w:abstractNumId="7" w15:restartNumberingAfterBreak="0">
+  <w:abstractNum w:abstractNumId="11" w15:restartNumberingAfterBreak="0">
     <w:nsid w:val="393D14DC"/>
     <w:multiLevelType w:val="multilevel"/>
     <w:tmpl w:val="CF42C952"/>
@@ -7130,7 +9193,7 @@
       </w:rPr>
     </w:lvl>
   </w:abstractNum>
-  <w:abstractNum w:abstractNumId="8" w15:restartNumberingAfterBreak="0">
+  <w:abstractNum w:abstractNumId="12" w15:restartNumberingAfterBreak="0">
     <w:nsid w:val="3C5967B5"/>
     <w:multiLevelType w:val="multilevel"/>
     <w:tmpl w:val="B51A2F70"/>
@@ -7243,7 +9306,7 @@
       </w:pPr>
     </w:lvl>
   </w:abstractNum>
-  <w:abstractNum w:abstractNumId="9" w15:restartNumberingAfterBreak="0">
+  <w:abstractNum w:abstractNumId="13" w15:restartNumberingAfterBreak="0">
     <w:nsid w:val="3C87486C"/>
     <w:multiLevelType w:val="multilevel"/>
     <w:tmpl w:val="51CC6A1E"/>
@@ -7392,7 +9455,7 @@
       </w:rPr>
     </w:lvl>
   </w:abstractNum>
-  <w:abstractNum w:abstractNumId="10" w15:restartNumberingAfterBreak="0">
+  <w:abstractNum w:abstractNumId="14" w15:restartNumberingAfterBreak="0">
     <w:nsid w:val="3D0829EB"/>
     <w:multiLevelType w:val="multilevel"/>
     <w:tmpl w:val="8D08E31E"/>
@@ -7505,7 +9568,7 @@
       </w:pPr>
     </w:lvl>
   </w:abstractNum>
-  <w:abstractNum w:abstractNumId="11" w15:restartNumberingAfterBreak="0">
+  <w:abstractNum w:abstractNumId="15" w15:restartNumberingAfterBreak="0">
     <w:nsid w:val="3D732425"/>
     <w:multiLevelType w:val="multilevel"/>
     <w:tmpl w:val="90CEBDCE"/>
@@ -7654,7 +9717,7 @@
       </w:rPr>
     </w:lvl>
   </w:abstractNum>
-  <w:abstractNum w:abstractNumId="12" w15:restartNumberingAfterBreak="0">
+  <w:abstractNum w:abstractNumId="16" w15:restartNumberingAfterBreak="0">
     <w:nsid w:val="3E4B125B"/>
     <w:multiLevelType w:val="multilevel"/>
     <w:tmpl w:val="9FF8900C"/>
@@ -7767,7 +9830,7 @@
       </w:pPr>
     </w:lvl>
   </w:abstractNum>
-  <w:abstractNum w:abstractNumId="13" w15:restartNumberingAfterBreak="0">
+  <w:abstractNum w:abstractNumId="17" w15:restartNumberingAfterBreak="0">
     <w:nsid w:val="426D1B37"/>
     <w:multiLevelType w:val="multilevel"/>
     <w:tmpl w:val="6A64D88A"/>
@@ -7884,7 +9947,7 @@
       </w:pPr>
     </w:lvl>
   </w:abstractNum>
-  <w:abstractNum w:abstractNumId="14" w15:restartNumberingAfterBreak="0">
+  <w:abstractNum w:abstractNumId="18" w15:restartNumberingAfterBreak="0">
     <w:nsid w:val="43696398"/>
     <w:multiLevelType w:val="multilevel"/>
     <w:tmpl w:val="22E88C50"/>
@@ -8033,7 +10096,7 @@
       </w:rPr>
     </w:lvl>
   </w:abstractNum>
-  <w:abstractNum w:abstractNumId="15" w15:restartNumberingAfterBreak="0">
+  <w:abstractNum w:abstractNumId="19" w15:restartNumberingAfterBreak="0">
     <w:nsid w:val="49B60A63"/>
     <w:multiLevelType w:val="multilevel"/>
     <w:tmpl w:val="4378E0AE"/>
@@ -8182,7 +10245,7 @@
       </w:rPr>
     </w:lvl>
   </w:abstractNum>
-  <w:abstractNum w:abstractNumId="16" w15:restartNumberingAfterBreak="0">
+  <w:abstractNum w:abstractNumId="20" w15:restartNumberingAfterBreak="0">
     <w:nsid w:val="56792520"/>
     <w:multiLevelType w:val="hybridMultilevel"/>
     <w:tmpl w:val="D94E3724"/>
@@ -8236,7 +10299,156 @@
       <w:lvlJc w:val="left"/>
     </w:lvl>
   </w:abstractNum>
-  <w:abstractNum w:abstractNumId="17" w15:restartNumberingAfterBreak="0">
+  <w:abstractNum w:abstractNumId="21" w15:restartNumberingAfterBreak="0">
+    <w:nsid w:val="570C21FC"/>
+    <w:multiLevelType w:val="multilevel"/>
+    <w:tmpl w:val="F38247CC"/>
+    <w:lvl w:ilvl="0">
+      <w:start w:val="1"/>
+      <w:numFmt w:val="bullet"/>
+      <w:lvlText w:val=""/>
+      <w:lvlJc w:val="left"/>
+      <w:pPr>
+        <w:tabs>
+          <w:tab w:val="num" w:pos="720"/>
+        </w:tabs>
+        <w:ind w:left="720" w:hanging="360"/>
+      </w:pPr>
+      <w:rPr>
+        <w:rFonts w:ascii="Symbol" w:hAnsi="Symbol" w:hint="default"/>
+        <w:sz w:val="20"/>
+      </w:rPr>
+    </w:lvl>
+    <w:lvl w:ilvl="1" w:tentative="1">
+      <w:start w:val="1"/>
+      <w:numFmt w:val="bullet"/>
+      <w:lvlText w:val=""/>
+      <w:lvlJc w:val="left"/>
+      <w:pPr>
+        <w:tabs>
+          <w:tab w:val="num" w:pos="1440"/>
+        </w:tabs>
+        <w:ind w:left="1440" w:hanging="360"/>
+      </w:pPr>
+      <w:rPr>
+        <w:rFonts w:ascii="Symbol" w:hAnsi="Symbol" w:hint="default"/>
+        <w:sz w:val="20"/>
+      </w:rPr>
+    </w:lvl>
+    <w:lvl w:ilvl="2" w:tentative="1">
+      <w:start w:val="1"/>
+      <w:numFmt w:val="bullet"/>
+      <w:lvlText w:val=""/>
+      <w:lvlJc w:val="left"/>
+      <w:pPr>
+        <w:tabs>
+          <w:tab w:val="num" w:pos="2160"/>
+        </w:tabs>
+        <w:ind w:left="2160" w:hanging="360"/>
+      </w:pPr>
+      <w:rPr>
+        <w:rFonts w:ascii="Symbol" w:hAnsi="Symbol" w:hint="default"/>
+        <w:sz w:val="20"/>
+      </w:rPr>
+    </w:lvl>
+    <w:lvl w:ilvl="3" w:tentative="1">
+      <w:start w:val="1"/>
+      <w:numFmt w:val="bullet"/>
+      <w:lvlText w:val=""/>
+      <w:lvlJc w:val="left"/>
+      <w:pPr>
+        <w:tabs>
+          <w:tab w:val="num" w:pos="2880"/>
+        </w:tabs>
+        <w:ind w:left="2880" w:hanging="360"/>
+      </w:pPr>
+      <w:rPr>
+        <w:rFonts w:ascii="Symbol" w:hAnsi="Symbol" w:hint="default"/>
+        <w:sz w:val="20"/>
+      </w:rPr>
+    </w:lvl>
+    <w:lvl w:ilvl="4" w:tentative="1">
+      <w:start w:val="1"/>
+      <w:numFmt w:val="bullet"/>
+      <w:lvlText w:val=""/>
+      <w:lvlJc w:val="left"/>
+      <w:pPr>
+        <w:tabs>
+          <w:tab w:val="num" w:pos="3600"/>
+        </w:tabs>
+        <w:ind w:left="3600" w:hanging="360"/>
+      </w:pPr>
+      <w:rPr>
+        <w:rFonts w:ascii="Symbol" w:hAnsi="Symbol" w:hint="default"/>
+        <w:sz w:val="20"/>
+      </w:rPr>
+    </w:lvl>
+    <w:lvl w:ilvl="5" w:tentative="1">
+      <w:start w:val="1"/>
+      <w:numFmt w:val="bullet"/>
+      <w:lvlText w:val=""/>
+      <w:lvlJc w:val="left"/>
+      <w:pPr>
+        <w:tabs>
+          <w:tab w:val="num" w:pos="4320"/>
+        </w:tabs>
+        <w:ind w:left="4320" w:hanging="360"/>
+      </w:pPr>
+      <w:rPr>
+        <w:rFonts w:ascii="Symbol" w:hAnsi="Symbol" w:hint="default"/>
+        <w:sz w:val="20"/>
+      </w:rPr>
+    </w:lvl>
+    <w:lvl w:ilvl="6" w:tentative="1">
+      <w:start w:val="1"/>
+      <w:numFmt w:val="bullet"/>
+      <w:lvlText w:val=""/>
+      <w:lvlJc w:val="left"/>
+      <w:pPr>
+        <w:tabs>
+          <w:tab w:val="num" w:pos="5040"/>
+        </w:tabs>
+        <w:ind w:left="5040" w:hanging="360"/>
+      </w:pPr>
+      <w:rPr>
+        <w:rFonts w:ascii="Symbol" w:hAnsi="Symbol" w:hint="default"/>
+        <w:sz w:val="20"/>
+      </w:rPr>
+    </w:lvl>
+    <w:lvl w:ilvl="7" w:tentative="1">
+      <w:start w:val="1"/>
+      <w:numFmt w:val="bullet"/>
+      <w:lvlText w:val=""/>
+      <w:lvlJc w:val="left"/>
+      <w:pPr>
+        <w:tabs>
+          <w:tab w:val="num" w:pos="5760"/>
+        </w:tabs>
+        <w:ind w:left="5760" w:hanging="360"/>
+      </w:pPr>
+      <w:rPr>
+        <w:rFonts w:ascii="Symbol" w:hAnsi="Symbol" w:hint="default"/>
+        <w:sz w:val="20"/>
+      </w:rPr>
+    </w:lvl>
+    <w:lvl w:ilvl="8" w:tentative="1">
+      <w:start w:val="1"/>
+      <w:numFmt w:val="bullet"/>
+      <w:lvlText w:val=""/>
+      <w:lvlJc w:val="left"/>
+      <w:pPr>
+        <w:tabs>
+          <w:tab w:val="num" w:pos="6480"/>
+        </w:tabs>
+        <w:ind w:left="6480" w:hanging="360"/>
+      </w:pPr>
+      <w:rPr>
+        <w:rFonts w:ascii="Symbol" w:hAnsi="Symbol" w:hint="default"/>
+        <w:sz w:val="20"/>
+      </w:rPr>
+    </w:lvl>
+  </w:abstractNum>
+  <w:abstractNum w:abstractNumId="22" w15:restartNumberingAfterBreak="0">
     <w:nsid w:val="65E24C49"/>
     <w:multiLevelType w:val="multilevel"/>
     <w:tmpl w:val="B6849BCE"/>
@@ -8385,7 +10597,7 @@
       </w:rPr>
     </w:lvl>
   </w:abstractNum>
-  <w:abstractNum w:abstractNumId="18" w15:restartNumberingAfterBreak="0">
+  <w:abstractNum w:abstractNumId="23" w15:restartNumberingAfterBreak="0">
     <w:nsid w:val="68FE1963"/>
     <w:multiLevelType w:val="multilevel"/>
     <w:tmpl w:val="29EA598A"/>
@@ -8534,7 +10746,7 @@
       </w:rPr>
     </w:lvl>
   </w:abstractNum>
-  <w:abstractNum w:abstractNumId="19" w15:restartNumberingAfterBreak="0">
+  <w:abstractNum w:abstractNumId="24" w15:restartNumberingAfterBreak="0">
     <w:nsid w:val="6B282D51"/>
     <w:multiLevelType w:val="multilevel"/>
     <w:tmpl w:val="572497C8"/>
@@ -8651,7 +10863,7 @@
       </w:pPr>
     </w:lvl>
   </w:abstractNum>
-  <w:abstractNum w:abstractNumId="20" w15:restartNumberingAfterBreak="0">
+  <w:abstractNum w:abstractNumId="25" w15:restartNumberingAfterBreak="0">
     <w:nsid w:val="725E6337"/>
     <w:multiLevelType w:val="multilevel"/>
     <w:tmpl w:val="08A28FFE"/>
@@ -8764,7 +10976,7 @@
       </w:pPr>
     </w:lvl>
   </w:abstractNum>
-  <w:abstractNum w:abstractNumId="21" w15:restartNumberingAfterBreak="0">
+  <w:abstractNum w:abstractNumId="26" w15:restartNumberingAfterBreak="0">
     <w:nsid w:val="789F4F67"/>
     <w:multiLevelType w:val="multilevel"/>
     <w:tmpl w:val="E1AE5374"/>
@@ -8913,7 +11125,7 @@
       </w:rPr>
     </w:lvl>
   </w:abstractNum>
-  <w:abstractNum w:abstractNumId="22" w15:restartNumberingAfterBreak="0">
+  <w:abstractNum w:abstractNumId="27" w15:restartNumberingAfterBreak="0">
     <w:nsid w:val="78D60CF5"/>
     <w:multiLevelType w:val="hybridMultilevel"/>
     <w:tmpl w:val="83164EB4"/>
@@ -8967,7 +11179,7 @@
       <w:lvlJc w:val="left"/>
     </w:lvl>
   </w:abstractNum>
-  <w:abstractNum w:abstractNumId="23" w15:restartNumberingAfterBreak="0">
+  <w:abstractNum w:abstractNumId="28" w15:restartNumberingAfterBreak="0">
     <w:nsid w:val="7BEC59D4"/>
     <w:multiLevelType w:val="multilevel"/>
     <w:tmpl w:val="BA82BC76"/>
@@ -9081,82 +11293,97 @@
     </w:lvl>
   </w:abstractNum>
   <w:num w:numId="1">
+    <w:abstractNumId w:val="7"/>
+  </w:num>
+  <w:num w:numId="2">
+    <w:abstractNumId w:val="23"/>
+  </w:num>
+  <w:num w:numId="3">
     <w:abstractNumId w:val="4"/>
   </w:num>
-  <w:num w:numId="2">
-    <w:abstractNumId w:val="18"/>
-  </w:num>
-  <w:num w:numId="3">
-    <w:abstractNumId w:val="1"/>
-  </w:num>
   <w:num w:numId="4">
-    <w:abstractNumId w:val="5"/>
+    <w:abstractNumId w:val="8"/>
   </w:num>
   <w:num w:numId="5">
-    <w:abstractNumId w:val="19"/>
+    <w:abstractNumId w:val="24"/>
   </w:num>
   <w:num w:numId="6">
-    <w:abstractNumId w:val="0"/>
+    <w:abstractNumId w:val="3"/>
   </w:num>
   <w:num w:numId="7">
-    <w:abstractNumId w:val="20"/>
+    <w:abstractNumId w:val="25"/>
   </w:num>
   <w:num w:numId="8">
-    <w:abstractNumId w:val="13"/>
+    <w:abstractNumId w:val="17"/>
   </w:num>
   <w:num w:numId="9">
-    <w:abstractNumId w:val="11"/>
+    <w:abstractNumId w:val="15"/>
   </w:num>
   <w:num w:numId="10">
-    <w:abstractNumId w:val="8"/>
+    <w:abstractNumId w:val="12"/>
   </w:num>
   <w:num w:numId="11">
-    <w:abstractNumId w:val="10"/>
+    <w:abstractNumId w:val="14"/>
   </w:num>
   <w:num w:numId="12">
-    <w:abstractNumId w:val="22"/>
+    <w:abstractNumId w:val="27"/>
     <w:lvlOverride w:ilvl="0">
       <w:startOverride w:val="1"/>
     </w:lvlOverride>
   </w:num>
   <w:num w:numId="13">
-    <w:abstractNumId w:val="16"/>
+    <w:abstractNumId w:val="20"/>
     <w:lvlOverride w:ilvl="0">
       <w:startOverride w:val="1"/>
     </w:lvlOverride>
   </w:num>
   <w:num w:numId="14">
-    <w:abstractNumId w:val="7"/>
+    <w:abstractNumId w:val="11"/>
   </w:num>
   <w:num w:numId="15">
-    <w:abstractNumId w:val="17"/>
+    <w:abstractNumId w:val="22"/>
   </w:num>
   <w:num w:numId="16">
-    <w:abstractNumId w:val="15"/>
+    <w:abstractNumId w:val="19"/>
   </w:num>
   <w:num w:numId="17">
-    <w:abstractNumId w:val="23"/>
+    <w:abstractNumId w:val="28"/>
   </w:num>
   <w:num w:numId="18">
+    <w:abstractNumId w:val="10"/>
+  </w:num>
+  <w:num w:numId="19">
+    <w:abstractNumId w:val="26"/>
+  </w:num>
+  <w:num w:numId="20">
+    <w:abstractNumId w:val="5"/>
+  </w:num>
+  <w:num w:numId="21">
+    <w:abstractNumId w:val="13"/>
+  </w:num>
+  <w:num w:numId="22">
+    <w:abstractNumId w:val="16"/>
+  </w:num>
+  <w:num w:numId="23">
+    <w:abstractNumId w:val="18"/>
+  </w:num>
+  <w:num w:numId="24">
     <w:abstractNumId w:val="6"/>
   </w:num>
-  <w:num w:numId="19">
-    <w:abstractNumId w:val="21"/>
+  <w:num w:numId="25">
+    <w:abstractNumId w:val="0"/>
   </w:num>
-  <w:num w:numId="20">
+  <w:num w:numId="26">
+    <w:abstractNumId w:val="1"/>
+  </w:num>
+  <w:num w:numId="27">
     <w:abstractNumId w:val="2"/>
   </w:num>
-  <w:num w:numId="21">
+  <w:num w:numId="28">
     <w:abstractNumId w:val="9"/>
   </w:num>
-  <w:num w:numId="22">
-    <w:abstractNumId w:val="12"/>
-  </w:num>
-  <w:num w:numId="23">
-    <w:abstractNumId w:val="14"/>
-  </w:num>
-  <w:num w:numId="24">
-    <w:abstractNumId w:val="3"/>
+  <w:num w:numId="29">
+    <w:abstractNumId w:val="21"/>
   </w:num>
 </w:numbering>
 </file>
@@ -10544,7 +12771,7 @@
 </file>
 
 <file path=customXml/itemProps1.xml><?xml version="1.0" encoding="utf-8"?>
-<ds:datastoreItem xmlns:ds="http://schemas.openxmlformats.org/officeDocument/2006/customXml" ds:itemID="{3AEB7F53-BEB6-4EFB-91CE-4AC85EF43F09}">
+<ds:datastoreItem xmlns:ds="http://schemas.openxmlformats.org/officeDocument/2006/customXml" ds:itemID="{8FCF72E9-E5FD-4BDA-B3F8-E7BD006E08F8}">
   <ds:schemaRefs>
     <ds:schemaRef ds:uri="http://schemas.openxmlformats.org/officeDocument/2006/bibliography"/>
   </ds:schemaRefs>

</xml_diff>